<commit_message>
Restructure submission for single author; tighten wording
- Single-author title page, contributions, declarations, cover letter
- Cover letter: "independent of age" -> "robust to age adjustment" (matches main text)
- Methods: de-duplicate muscle-cohort accession list
</commit_message>
<xml_diff>
--- a/submission/Cover_letter.docx
+++ b/submission/Cover_letter.docx
@@ -7,7 +7,19 @@
         <w:pStyle w:val="FirstParagraph"/>
       </w:pPr>
       <w:r>
-        <w:t xml:space="preserve">[Author name / Department / Institution / Address]</w:t>
+        <w:t xml:space="preserve">‹Full Name›</w:t>
+      </w:r>
+      <w:r>
+        <w:t xml:space="preserve"> </w:t>
+      </w:r>
+      <w:r>
+        <w:t xml:space="preserve">‹Department, Institution›</w:t>
+      </w:r>
+      <w:r>
+        <w:t xml:space="preserve"> </w:t>
+      </w:r>
+      <w:r>
+        <w:t xml:space="preserve">‹Postal address›</w:t>
       </w:r>
     </w:p>
     <w:p>
@@ -15,7 +27,7 @@
         <w:pStyle w:val="BodyText"/>
       </w:pPr>
       <w:r>
-        <w:t xml:space="preserve">[Date]</w:t>
+        <w:t xml:space="preserve">‹Date›</w:t>
       </w:r>
     </w:p>
     <w:p>
@@ -104,13 +116,13 @@
           <w:b/>
           <w:bCs/>
         </w:rPr>
-        <w:t xml:space="preserve">independent of patient age</w:t>
+        <w:t xml:space="preserve">robust to age adjustment</w:t>
       </w:r>
       <w:r>
         <w:t xml:space="preserve"> </w:t>
       </w:r>
       <w:r>
-        <w:t xml:space="preserve">(AUC 0.95 after age adjustment; p = 1.8 × 10⁻¹⁸) and of HF etiology, whereas the muscle component remains ageing-linked — a distinction we make explicit rather than gloss over; and (4) candidate upstream regulation converges on the canonical miR-15/16/195/497 → CCND1 cell-cycle axis, with single-cell mapping (1.9 million cells) placing the NAD/immune hub NAMPT in myeloid cells and the matrix hub FBLN1 in stromal cells of both tissues.</w:t>
+        <w:t xml:space="preserve">(AUC 0.95 after adjusting for age; p = 1.8 × 10⁻¹⁸) and to HF etiology, whereas the muscle component remains ageing-linked — a distinction we make explicit rather than gloss over; and (4) candidate upstream regulation converges on the canonical miR-15/16/195/497 → CCND1 cell-cycle axis, with single-cell mapping (1.9 million cells) placing the NAD/immune hub NAMPT in myeloid cells and the matrix hub FBLN1 in stromal cells of both tissues.</w:t>
       </w:r>
     </w:p>
     <w:p>
@@ -152,7 +164,7 @@
         <w:pStyle w:val="BodyText"/>
       </w:pPr>
       <w:r>
-        <w:t xml:space="preserve">We confirm that this manuscript is original, has not been published previously, and is not under consideration for publication elsewhere. All authors have read and approved the submitted version and agree to its submission. The study is a secondary analysis of publicly available, de-identified data and required no new ethics approval. The authors declare no competing interests. All datasets are public (GEO accessions listed in the manuscript) and the complete, reproducible analysis pipeline is openly available at https://github.com/candicewu0515/HF-muscle-ageing-signature.</w:t>
+        <w:t xml:space="preserve">I confirm that this manuscript is original, has not been published previously, and is not under consideration for publication elsewhere. As the sole author I have read and approved the submitted version. The study is a secondary analysis of publicly available, de-identified data and required no new ethics approval. I declare no competing interests. All datasets are public (GEO accessions listed in the manuscript) and the complete, reproducible analysis pipeline is openly available at https://github.com/candicewu0515/HF-muscle-ageing-signature.</w:t>
       </w:r>
     </w:p>
     <w:p>
@@ -176,13 +188,13 @@
         <w:pStyle w:val="BodyText"/>
       </w:pPr>
       <w:r>
-        <w:t xml:space="preserve">[Corresponding author name], on behalf of all authors</w:t>
+        <w:t xml:space="preserve">‹Full Name›</w:t>
       </w:r>
       <w:r>
         <w:t xml:space="preserve"> </w:t>
       </w:r>
       <w:r>
-        <w:t xml:space="preserve">[Department, Institution]</w:t>
+        <w:t xml:space="preserve">‹Department, Institution›</w:t>
       </w:r>
       <w:r>
         <w:t xml:space="preserve"> </w:t>

</xml_diff>

<commit_message>
Fill author identity: Xia Wu (University of Iowa), ORCID, institutional email, date
</commit_message>
<xml_diff>
--- a/submission/Cover_letter.docx
+++ b/submission/Cover_letter.docx
@@ -7,19 +7,19 @@
         <w:pStyle w:val="FirstParagraph"/>
       </w:pPr>
       <w:r>
-        <w:t xml:space="preserve">‹Full Name›</w:t>
+        <w:t xml:space="preserve">Xia Wu</w:t>
       </w:r>
       <w:r>
         <w:t xml:space="preserve"> </w:t>
       </w:r>
       <w:r>
-        <w:t xml:space="preserve">‹Department, Institution›</w:t>
+        <w:t xml:space="preserve">Department of Internal Medicine, Carver College of Medicine, University of Iowa</w:t>
       </w:r>
       <w:r>
         <w:t xml:space="preserve"> </w:t>
       </w:r>
       <w:r>
-        <w:t xml:space="preserve">‹Postal address›</w:t>
+        <w:t xml:space="preserve">Iowa City, IA, USA</w:t>
       </w:r>
     </w:p>
     <w:p>
@@ -27,7 +27,7 @@
         <w:pStyle w:val="BodyText"/>
       </w:pPr>
       <w:r>
-        <w:t xml:space="preserve">‹Date›</w:t>
+        <w:t xml:space="preserve">25 June 2026</w:t>
       </w:r>
     </w:p>
     <w:p>
@@ -188,19 +188,19 @@
         <w:pStyle w:val="BodyText"/>
       </w:pPr>
       <w:r>
-        <w:t xml:space="preserve">‹Full Name›</w:t>
+        <w:t xml:space="preserve">Xia Wu</w:t>
       </w:r>
       <w:r>
         <w:t xml:space="preserve"> </w:t>
       </w:r>
       <w:r>
-        <w:t xml:space="preserve">‹Department, Institution›</w:t>
+        <w:t xml:space="preserve">Department of Internal Medicine, Carver College of Medicine, University of Iowa</w:t>
       </w:r>
       <w:r>
         <w:t xml:space="preserve"> </w:t>
       </w:r>
       <w:r>
-        <w:t xml:space="preserve">E-mail: candicewu0515@gmail.com</w:t>
+        <w:t xml:space="preserve">E-mail: xwu76@uiowa.edu; ORCID iD: 0009-0006-9852-812X</w:t>
       </w:r>
     </w:p>
     <w:sectPr>

</xml_diff>